<commit_message>
Changed the app Title and fixed note updatt date mechanic
</commit_message>
<xml_diff>
--- a/docs/lab1.docx
+++ b/docs/lab1.docx
@@ -932,7 +932,6 @@
           <w:rFonts w:ascii="Times New Roman" w:hAnsi="Times New Roman" w:cs="Times New Roman"/>
           <w:sz w:val="28"/>
           <w:szCs w:val="28"/>
-          <w:lang w:val="en-US"/>
         </w:rPr>
       </w:pPr>
       <w:r>
@@ -976,6 +975,33 @@
         </w:rPr>
         <w:t xml:space="preserve">. Данное приложение должно осуществлять работу с заметками (их </w:t>
       </w:r>
+      <w:r>
+        <w:rPr>
+          <w:rFonts w:ascii="Times New Roman" w:hAnsi="Times New Roman" w:cs="Times New Roman"/>
+          <w:sz w:val="28"/>
+          <w:szCs w:val="28"/>
+        </w:rPr>
+        <w:t>создание, изменение и удаление).</w:t>
+      </w:r>
+    </w:p>
+    <w:p>
+      <w:pPr>
+        <w:rPr>
+          <w:rFonts w:ascii="Times New Roman" w:hAnsi="Times New Roman" w:cs="Times New Roman"/>
+          <w:b/>
+          <w:sz w:val="28"/>
+          <w:szCs w:val="28"/>
+        </w:rPr>
+      </w:pPr>
+      <w:r>
+        <w:rPr>
+          <w:rFonts w:ascii="Times New Roman" w:hAnsi="Times New Roman" w:cs="Times New Roman"/>
+          <w:b/>
+          <w:sz w:val="28"/>
+          <w:szCs w:val="28"/>
+        </w:rPr>
+        <w:br w:type="page"/>
+      </w:r>
     </w:p>
     <w:p>
       <w:pPr>
@@ -995,7 +1021,17 @@
           <w:sz w:val="28"/>
           <w:szCs w:val="28"/>
         </w:rPr>
-        <w:t>1 ОСНОВНАЯ ЧАСТЬ</w:t>
+        <w:lastRenderedPageBreak/>
+        <w:t xml:space="preserve">1 </w:t>
+      </w:r>
+      <w:r>
+        <w:rPr>
+          <w:rFonts w:ascii="Times New Roman" w:hAnsi="Times New Roman" w:cs="Times New Roman"/>
+          <w:b/>
+          <w:sz w:val="28"/>
+          <w:szCs w:val="28"/>
+        </w:rPr>
+        <w:t>ЛИСТИНГ ПРИЛОЖЕНИЯ</w:t>
       </w:r>
     </w:p>
     <w:p>
@@ -1008,11 +1044,254 @@
           <w:szCs w:val="28"/>
         </w:rPr>
       </w:pPr>
-    </w:p>
-    <w:p>
-      <w:pPr>
-        <w:spacing w:after="0" w:line="360" w:lineRule="auto"/>
+      <w:r>
+        <w:rPr>
+          <w:rFonts w:ascii="Times New Roman" w:hAnsi="Times New Roman" w:cs="Times New Roman"/>
+          <w:sz w:val="28"/>
+          <w:szCs w:val="28"/>
+        </w:rPr>
+        <w:tab/>
+        <w:t>Был разработан следующий интерфейс, продемонстрированный на</w:t>
+      </w:r>
+      <w:r>
+        <w:rPr>
+          <w:rFonts w:ascii="Times New Roman" w:hAnsi="Times New Roman" w:cs="Times New Roman"/>
+          <w:sz w:val="28"/>
+          <w:szCs w:val="28"/>
+        </w:rPr>
+        <w:t xml:space="preserve"> </w:t>
+      </w:r>
+      <w:fldSimple w:instr=" REF _Ref240467422 \h  \* MERGEFORMAT ">
+        <w:r>
+          <w:rPr>
+            <w:rFonts w:ascii="Times New Roman" w:hAnsi="Times New Roman" w:cs="Times New Roman"/>
+            <w:color w:val="000000" w:themeColor="text1"/>
+            <w:sz w:val="28"/>
+            <w:szCs w:val="28"/>
+          </w:rPr>
+          <w:t>рису</w:t>
+        </w:r>
+        <w:r>
+          <w:rPr>
+            <w:rFonts w:ascii="Times New Roman" w:hAnsi="Times New Roman" w:cs="Times New Roman"/>
+            <w:color w:val="000000" w:themeColor="text1"/>
+            <w:sz w:val="28"/>
+            <w:szCs w:val="28"/>
+          </w:rPr>
+          <w:t>н</w:t>
+        </w:r>
+        <w:r>
+          <w:rPr>
+            <w:rFonts w:ascii="Times New Roman" w:hAnsi="Times New Roman" w:cs="Times New Roman"/>
+            <w:color w:val="000000" w:themeColor="text1"/>
+            <w:sz w:val="28"/>
+            <w:szCs w:val="28"/>
+          </w:rPr>
+          <w:t xml:space="preserve">ке </w:t>
+        </w:r>
+        <w:r>
+          <w:rPr>
+            <w:rFonts w:ascii="Times New Roman" w:hAnsi="Times New Roman" w:cs="Times New Roman"/>
+            <w:color w:val="000000" w:themeColor="text1"/>
+            <w:sz w:val="28"/>
+            <w:szCs w:val="28"/>
+          </w:rPr>
+          <w:t>1.</w:t>
+        </w:r>
+        <w:r>
+          <w:rPr>
+            <w:rFonts w:ascii="Times New Roman" w:hAnsi="Times New Roman" w:cs="Times New Roman"/>
+            <w:noProof/>
+            <w:color w:val="000000" w:themeColor="text1"/>
+            <w:sz w:val="28"/>
+            <w:szCs w:val="28"/>
+          </w:rPr>
+          <w:t>1</w:t>
+        </w:r>
+      </w:fldSimple>
+      <w:r>
+        <w:rPr>
+          <w:rFonts w:ascii="Times New Roman" w:hAnsi="Times New Roman" w:cs="Times New Roman"/>
+          <w:sz w:val="28"/>
+          <w:szCs w:val="28"/>
+        </w:rPr>
+        <w:t>.</w:t>
+      </w:r>
+    </w:p>
+    <w:p>
+      <w:pPr>
+        <w:keepNext/>
+        <w:spacing w:after="0" w:line="240" w:lineRule="auto"/>
         <w:jc w:val="center"/>
+      </w:pPr>
+      <w:r>
+        <w:rPr>
+          <w:rFonts w:ascii="Times New Roman" w:hAnsi="Times New Roman" w:cs="Times New Roman"/>
+          <w:noProof/>
+          <w:sz w:val="28"/>
+          <w:szCs w:val="28"/>
+          <w:lang w:eastAsia="ru-RU"/>
+        </w:rPr>
+        <w:drawing>
+          <wp:inline distT="0" distB="0" distL="0" distR="0">
+            <wp:extent cx="4458707" cy="5029200"/>
+            <wp:effectExtent l="19050" t="0" r="0" b="0"/>
+            <wp:docPr id="1" name="Рисунок 1"/>
+            <wp:cNvGraphicFramePr>
+              <a:graphicFrameLocks xmlns:a="http://schemas.openxmlformats.org/drawingml/2006/main" noChangeAspect="1"/>
+            </wp:cNvGraphicFramePr>
+            <a:graphic xmlns:a="http://schemas.openxmlformats.org/drawingml/2006/main">
+              <a:graphicData uri="http://schemas.openxmlformats.org/drawingml/2006/picture">
+                <pic:pic xmlns:pic="http://schemas.openxmlformats.org/drawingml/2006/picture">
+                  <pic:nvPicPr>
+                    <pic:cNvPr id="0" name="Picture 1"/>
+                    <pic:cNvPicPr>
+                      <a:picLocks noChangeAspect="1" noChangeArrowheads="1"/>
+                    </pic:cNvPicPr>
+                  </pic:nvPicPr>
+                  <pic:blipFill>
+                    <a:blip r:embed="rId7"/>
+                    <a:srcRect/>
+                    <a:stretch>
+                      <a:fillRect/>
+                    </a:stretch>
+                  </pic:blipFill>
+                  <pic:spPr bwMode="auto">
+                    <a:xfrm>
+                      <a:off x="0" y="0"/>
+                      <a:ext cx="4460387" cy="5031095"/>
+                    </a:xfrm>
+                    <a:prstGeom prst="rect">
+                      <a:avLst/>
+                    </a:prstGeom>
+                    <a:noFill/>
+                    <a:ln w="9525">
+                      <a:noFill/>
+                      <a:miter lim="800000"/>
+                      <a:headEnd/>
+                      <a:tailEnd/>
+                    </a:ln>
+                  </pic:spPr>
+                </pic:pic>
+              </a:graphicData>
+            </a:graphic>
+          </wp:inline>
+        </w:drawing>
+      </w:r>
+    </w:p>
+    <w:p>
+      <w:pPr>
+        <w:pStyle w:val="ab"/>
+        <w:spacing w:after="0"/>
+        <w:jc w:val="center"/>
+        <w:rPr>
+          <w:rFonts w:ascii="Times New Roman" w:hAnsi="Times New Roman" w:cs="Times New Roman"/>
+          <w:b w:val="0"/>
+          <w:color w:val="000000" w:themeColor="text1"/>
+          <w:sz w:val="28"/>
+          <w:szCs w:val="28"/>
+        </w:rPr>
+      </w:pPr>
+      <w:bookmarkStart w:id="0" w:name="_Ref240467407"/>
+      <w:bookmarkStart w:id="1" w:name="_Ref240467422"/>
+      <w:r>
+        <w:rPr>
+          <w:rFonts w:ascii="Times New Roman" w:hAnsi="Times New Roman" w:cs="Times New Roman"/>
+          <w:b w:val="0"/>
+          <w:color w:val="000000" w:themeColor="text1"/>
+          <w:sz w:val="28"/>
+          <w:szCs w:val="28"/>
+        </w:rPr>
+        <w:t xml:space="preserve">Рисунок </w:t>
+      </w:r>
+      <w:r>
+        <w:rPr>
+          <w:rFonts w:ascii="Times New Roman" w:hAnsi="Times New Roman" w:cs="Times New Roman"/>
+          <w:b w:val="0"/>
+          <w:color w:val="000000" w:themeColor="text1"/>
+          <w:sz w:val="28"/>
+          <w:szCs w:val="28"/>
+        </w:rPr>
+        <w:fldChar w:fldCharType="begin"/>
+      </w:r>
+      <w:r>
+        <w:rPr>
+          <w:rFonts w:ascii="Times New Roman" w:hAnsi="Times New Roman" w:cs="Times New Roman"/>
+          <w:b w:val="0"/>
+          <w:color w:val="000000" w:themeColor="text1"/>
+          <w:sz w:val="28"/>
+          <w:szCs w:val="28"/>
+        </w:rPr>
+        <w:instrText xml:space="preserve"> SEQ Рисунок \* ARABIC </w:instrText>
+      </w:r>
+      <w:r>
+        <w:rPr>
+          <w:rFonts w:ascii="Times New Roman" w:hAnsi="Times New Roman" w:cs="Times New Roman"/>
+          <w:b w:val="0"/>
+          <w:color w:val="000000" w:themeColor="text1"/>
+          <w:sz w:val="28"/>
+          <w:szCs w:val="28"/>
+        </w:rPr>
+        <w:fldChar w:fldCharType="separate"/>
+      </w:r>
+      <w:r>
+        <w:rPr>
+          <w:rFonts w:ascii="Times New Roman" w:hAnsi="Times New Roman" w:cs="Times New Roman"/>
+          <w:b w:val="0"/>
+          <w:noProof/>
+          <w:color w:val="000000" w:themeColor="text1"/>
+          <w:sz w:val="28"/>
+          <w:szCs w:val="28"/>
+        </w:rPr>
+        <w:t>1</w:t>
+      </w:r>
+      <w:r>
+        <w:rPr>
+          <w:rFonts w:ascii="Times New Roman" w:hAnsi="Times New Roman" w:cs="Times New Roman"/>
+          <w:b w:val="0"/>
+          <w:color w:val="000000" w:themeColor="text1"/>
+          <w:sz w:val="28"/>
+          <w:szCs w:val="28"/>
+        </w:rPr>
+        <w:fldChar w:fldCharType="end"/>
+      </w:r>
+      <w:bookmarkEnd w:id="1"/>
+      <w:r>
+        <w:rPr>
+          <w:rFonts w:ascii="Times New Roman" w:hAnsi="Times New Roman" w:cs="Times New Roman"/>
+          <w:b w:val="0"/>
+          <w:color w:val="000000" w:themeColor="text1"/>
+          <w:sz w:val="28"/>
+          <w:szCs w:val="28"/>
+        </w:rPr>
+        <w:t>.1</w:t>
+      </w:r>
+      <w:r>
+        <w:rPr>
+          <w:rFonts w:ascii="Times New Roman" w:hAnsi="Times New Roman" w:cs="Times New Roman"/>
+          <w:b w:val="0"/>
+          <w:color w:val="000000" w:themeColor="text1"/>
+          <w:sz w:val="28"/>
+          <w:szCs w:val="28"/>
+        </w:rPr>
+        <w:t xml:space="preserve"> - Интерфейс приложения</w:t>
+      </w:r>
+      <w:bookmarkEnd w:id="0"/>
+    </w:p>
+    <w:p>
+      <w:pPr>
+        <w:spacing w:after="0" w:line="360" w:lineRule="auto"/>
+        <w:jc w:val="both"/>
+        <w:rPr>
+          <w:sz w:val="28"/>
+          <w:szCs w:val="28"/>
+        </w:rPr>
+      </w:pPr>
+    </w:p>
+    <w:p>
+      <w:pPr>
+        <w:spacing w:after="0" w:line="360" w:lineRule="auto"/>
+        <w:jc w:val="center"/>
         <w:rPr>
           <w:rFonts w:ascii="Times New Roman" w:hAnsi="Times New Roman" w:cs="Times New Roman"/>
           <w:b/>
@@ -1042,7 +1321,7 @@
       </w:pPr>
     </w:p>
     <w:sectPr>
-      <w:footerReference w:type="default" r:id="rId7"/>
+      <w:footerReference w:type="default" r:id="rId8"/>
       <w:pgSz w:w="11906" w:h="16838"/>
       <w:pgMar w:top="1134" w:right="850" w:bottom="1134" w:left="1701" w:header="708" w:footer="708" w:gutter="0"/>
       <w:cols w:space="708"/>
@@ -1121,7 +1400,7 @@
             <w:sz w:val="28"/>
             <w:szCs w:val="28"/>
           </w:rPr>
-          <w:t>2</w:t>
+          <w:t>3</w:t>
         </w:r>
         <w:r>
           <w:rPr>
@@ -1449,6 +1728,55 @@
     <w:uiPriority w:val="99"/>
     <w:rsid w:val="00B71F59"/>
   </w:style>
+  <w:style w:type="paragraph" w:styleId="a9">
+    <w:name w:val="Balloon Text"/>
+    <w:basedOn w:val="a"/>
+    <w:link w:val="aa"/>
+    <w:uiPriority w:val="99"/>
+    <w:semiHidden/>
+    <w:unhideWhenUsed/>
+    <w:rsid w:val="00140E2F"/>
+    <w:pPr>
+      <w:spacing w:after="0" w:line="240" w:lineRule="auto"/>
+    </w:pPr>
+    <w:rPr>
+      <w:rFonts w:ascii="Tahoma" w:hAnsi="Tahoma" w:cs="Tahoma"/>
+      <w:sz w:val="16"/>
+      <w:szCs w:val="16"/>
+    </w:rPr>
+  </w:style>
+  <w:style w:type="character" w:customStyle="1" w:styleId="aa">
+    <w:name w:val="Текст выноски Знак"/>
+    <w:basedOn w:val="a0"/>
+    <w:link w:val="a9"/>
+    <w:uiPriority w:val="99"/>
+    <w:semiHidden/>
+    <w:rsid w:val="00140E2F"/>
+    <w:rPr>
+      <w:rFonts w:ascii="Tahoma" w:hAnsi="Tahoma" w:cs="Tahoma"/>
+      <w:sz w:val="16"/>
+      <w:szCs w:val="16"/>
+    </w:rPr>
+  </w:style>
+  <w:style w:type="paragraph" w:styleId="ab">
+    <w:name w:val="caption"/>
+    <w:basedOn w:val="a"/>
+    <w:next w:val="a"/>
+    <w:uiPriority w:val="35"/>
+    <w:unhideWhenUsed/>
+    <w:qFormat/>
+    <w:rsid w:val="00140E2F"/>
+    <w:pPr>
+      <w:spacing w:line="240" w:lineRule="auto"/>
+    </w:pPr>
+    <w:rPr>
+      <w:b/>
+      <w:bCs/>
+      <w:color w:val="4F81BD" w:themeColor="accent1"/>
+      <w:sz w:val="18"/>
+      <w:szCs w:val="18"/>
+    </w:rPr>
+  </w:style>
 </w:styles>
 </file>
 

</xml_diff>

<commit_message>
Added some text to documentation
</commit_message>
<xml_diff>
--- a/docs/lab1.docx
+++ b/docs/lab1.docx
@@ -932,7 +932,6 @@
           <w:rFonts w:ascii="Times New Roman" w:hAnsi="Times New Roman" w:cs="Times New Roman"/>
           <w:sz w:val="28"/>
           <w:szCs w:val="28"/>
-          <w:lang w:val="en-US"/>
         </w:rPr>
       </w:pPr>
       <w:r>
@@ -976,6 +975,33 @@
         </w:rPr>
         <w:t xml:space="preserve">. Данное приложение должно осуществлять работу с заметками (их </w:t>
       </w:r>
+      <w:r>
+        <w:rPr>
+          <w:rFonts w:ascii="Times New Roman" w:hAnsi="Times New Roman" w:cs="Times New Roman"/>
+          <w:sz w:val="28"/>
+          <w:szCs w:val="28"/>
+        </w:rPr>
+        <w:t>создание, изменение и удаление).</w:t>
+      </w:r>
+    </w:p>
+    <w:p>
+      <w:pPr>
+        <w:rPr>
+          <w:rFonts w:ascii="Times New Roman" w:hAnsi="Times New Roman" w:cs="Times New Roman"/>
+          <w:b/>
+          <w:sz w:val="28"/>
+          <w:szCs w:val="28"/>
+        </w:rPr>
+      </w:pPr>
+      <w:r>
+        <w:rPr>
+          <w:rFonts w:ascii="Times New Roman" w:hAnsi="Times New Roman" w:cs="Times New Roman"/>
+          <w:b/>
+          <w:sz w:val="28"/>
+          <w:szCs w:val="28"/>
+        </w:rPr>
+        <w:br w:type="page"/>
+      </w:r>
     </w:p>
     <w:p>
       <w:pPr>
@@ -995,6 +1021,7 @@
           <w:sz w:val="28"/>
           <w:szCs w:val="28"/>
         </w:rPr>
+        <w:lastRenderedPageBreak/>
         <w:t>1 ОСНОВНАЯ ЧАСТЬ</w:t>
       </w:r>
     </w:p>
@@ -1002,6 +1029,26 @@
       <w:pPr>
         <w:spacing w:after="0" w:line="360" w:lineRule="auto"/>
         <w:jc w:val="both"/>
+        <w:rPr>
+          <w:rFonts w:ascii="Times New Roman" w:hAnsi="Times New Roman" w:cs="Times New Roman"/>
+          <w:sz w:val="28"/>
+          <w:szCs w:val="28"/>
+        </w:rPr>
+      </w:pPr>
+      <w:r>
+        <w:rPr>
+          <w:rFonts w:ascii="Times New Roman" w:hAnsi="Times New Roman" w:cs="Times New Roman"/>
+          <w:sz w:val="28"/>
+          <w:szCs w:val="28"/>
+        </w:rPr>
+        <w:tab/>
+        <w:t>Был разработан следующий интерфейс приложения:</w:t>
+      </w:r>
+    </w:p>
+    <w:p>
+      <w:pPr>
+        <w:spacing w:after="0" w:line="360" w:lineRule="auto"/>
+        <w:jc w:val="center"/>
         <w:rPr>
           <w:rFonts w:ascii="Times New Roman" w:hAnsi="Times New Roman" w:cs="Times New Roman"/>
           <w:sz w:val="28"/>

</xml_diff>

<commit_message>
Released documentation for Lab1 application
</commit_message>
<xml_diff>
--- a/docs/lab1.docx
+++ b/docs/lab1.docx
@@ -1126,17 +1126,14 @@
       </w:pPr>
       <w:r>
         <w:rPr>
-          <w:rFonts w:ascii="Times New Roman" w:hAnsi="Times New Roman" w:cs="Times New Roman"/>
           <w:noProof/>
-          <w:sz w:val="28"/>
-          <w:szCs w:val="28"/>
           <w:lang w:eastAsia="ru-RU"/>
         </w:rPr>
         <w:drawing>
           <wp:inline distT="0" distB="0" distL="0" distR="0">
-            <wp:extent cx="4458707" cy="5029200"/>
-            <wp:effectExtent l="19050" t="0" r="0" b="0"/>
-            <wp:docPr id="1" name="Рисунок 1"/>
+            <wp:extent cx="3441138" cy="4320540"/>
+            <wp:effectExtent l="19050" t="0" r="6912" b="0"/>
+            <wp:docPr id="2" name="Рисунок 1"/>
             <wp:cNvGraphicFramePr>
               <a:graphicFrameLocks xmlns:a="http://schemas.openxmlformats.org/drawingml/2006/main" noChangeAspect="1"/>
             </wp:cNvGraphicFramePr>
@@ -1159,7 +1156,7 @@
                   <pic:spPr bwMode="auto">
                     <a:xfrm>
                       <a:off x="0" y="0"/>
-                      <a:ext cx="4460387" cy="5031095"/>
+                      <a:ext cx="3441138" cy="4320540"/>
                     </a:xfrm>
                     <a:prstGeom prst="rect">
                       <a:avLst/>
@@ -1192,8 +1189,8 @@
           <w:szCs w:val="28"/>
         </w:rPr>
       </w:pPr>
-      <w:bookmarkStart w:id="0" w:name="_Ref240467407"/>
-      <w:bookmarkStart w:id="1" w:name="_Ref240467422"/>
+      <w:bookmarkStart w:id="0" w:name="_Ref240467422"/>
+      <w:bookmarkStart w:id="1" w:name="_Ref240467407"/>
       <w:r>
         <w:rPr>
           <w:rFonts w:ascii="Times New Roman" w:hAnsi="Times New Roman" w:cs="Times New Roman"/>
@@ -1255,28 +1252,28 @@
         </w:rPr>
         <w:fldChar w:fldCharType="end"/>
       </w:r>
+      <w:bookmarkEnd w:id="0"/>
+      <w:r>
+        <w:rPr>
+          <w:rFonts w:ascii="Times New Roman" w:hAnsi="Times New Roman" w:cs="Times New Roman"/>
+          <w:b w:val="0"/>
+          <w:color w:val="000000" w:themeColor="text1"/>
+          <w:sz w:val="28"/>
+          <w:szCs w:val="28"/>
+        </w:rPr>
+        <w:t>.1</w:t>
+      </w:r>
+      <w:r>
+        <w:rPr>
+          <w:rFonts w:ascii="Times New Roman" w:hAnsi="Times New Roman" w:cs="Times New Roman"/>
+          <w:b w:val="0"/>
+          <w:color w:val="000000" w:themeColor="text1"/>
+          <w:sz w:val="28"/>
+          <w:szCs w:val="28"/>
+        </w:rPr>
+        <w:t xml:space="preserve"> - Интерфейс приложения</w:t>
+      </w:r>
       <w:bookmarkEnd w:id="1"/>
-      <w:r>
-        <w:rPr>
-          <w:rFonts w:ascii="Times New Roman" w:hAnsi="Times New Roman" w:cs="Times New Roman"/>
-          <w:b w:val="0"/>
-          <w:color w:val="000000" w:themeColor="text1"/>
-          <w:sz w:val="28"/>
-          <w:szCs w:val="28"/>
-        </w:rPr>
-        <w:t>.1</w:t>
-      </w:r>
-      <w:r>
-        <w:rPr>
-          <w:rFonts w:ascii="Times New Roman" w:hAnsi="Times New Roman" w:cs="Times New Roman"/>
-          <w:b w:val="0"/>
-          <w:color w:val="000000" w:themeColor="text1"/>
-          <w:sz w:val="28"/>
-          <w:szCs w:val="28"/>
-        </w:rPr>
-        <w:t xml:space="preserve"> - Интерфейс приложения</w:t>
-      </w:r>
-      <w:bookmarkEnd w:id="0"/>
     </w:p>
     <w:p>
       <w:pPr>
@@ -1285,13 +1282,1028 @@
         <w:rPr>
           <w:sz w:val="28"/>
           <w:szCs w:val="28"/>
-        </w:rPr>
-      </w:pPr>
-    </w:p>
-    <w:p>
-      <w:pPr>
-        <w:spacing w:after="0" w:line="360" w:lineRule="auto"/>
+          <w:lang w:val="en-US"/>
+        </w:rPr>
+      </w:pPr>
+    </w:p>
+    <w:p>
+      <w:pPr>
+        <w:spacing w:after="0" w:line="360" w:lineRule="auto"/>
+        <w:jc w:val="both"/>
+        <w:rPr>
+          <w:sz w:val="28"/>
+          <w:szCs w:val="28"/>
+        </w:rPr>
+      </w:pPr>
+      <w:r>
+        <w:rPr>
+          <w:sz w:val="28"/>
+          <w:szCs w:val="28"/>
+        </w:rPr>
+        <w:tab/>
+        <w:t xml:space="preserve">Данное приложение позволяет: создавать заметки, их изменять и удалять. При нажатии на кнопку </w:t>
+      </w:r>
+      <w:r>
+        <w:rPr>
+          <w:sz w:val="28"/>
+          <w:szCs w:val="28"/>
+        </w:rPr>
+        <w:t>“</w:t>
+      </w:r>
+      <w:r>
+        <w:rPr>
+          <w:sz w:val="28"/>
+          <w:szCs w:val="28"/>
+        </w:rPr>
+        <w:t>Создать</w:t>
+      </w:r>
+      <w:r>
+        <w:rPr>
+          <w:sz w:val="28"/>
+          <w:szCs w:val="28"/>
+        </w:rPr>
+        <w:t>”</w:t>
+      </w:r>
+      <w:r>
+        <w:rPr>
+          <w:sz w:val="28"/>
+          <w:szCs w:val="28"/>
+        </w:rPr>
+        <w:t xml:space="preserve"> Открывается окно создания заметки:</w:t>
+      </w:r>
+    </w:p>
+    <w:p>
+      <w:pPr>
+        <w:keepNext/>
+        <w:spacing w:after="0" w:line="240" w:lineRule="auto"/>
         <w:jc w:val="center"/>
+      </w:pPr>
+      <w:r>
+        <w:rPr>
+          <w:noProof/>
+          <w:sz w:val="28"/>
+          <w:szCs w:val="28"/>
+          <w:lang w:eastAsia="ru-RU"/>
+        </w:rPr>
+        <w:lastRenderedPageBreak/>
+        <w:drawing>
+          <wp:inline distT="0" distB="0" distL="0" distR="0">
+            <wp:extent cx="3120649" cy="3889072"/>
+            <wp:effectExtent l="19050" t="0" r="3551" b="0"/>
+            <wp:docPr id="4" name="Рисунок 4"/>
+            <wp:cNvGraphicFramePr>
+              <a:graphicFrameLocks xmlns:a="http://schemas.openxmlformats.org/drawingml/2006/main" noChangeAspect="1"/>
+            </wp:cNvGraphicFramePr>
+            <a:graphic xmlns:a="http://schemas.openxmlformats.org/drawingml/2006/main">
+              <a:graphicData uri="http://schemas.openxmlformats.org/drawingml/2006/picture">
+                <pic:pic xmlns:pic="http://schemas.openxmlformats.org/drawingml/2006/picture">
+                  <pic:nvPicPr>
+                    <pic:cNvPr id="0" name="Picture 4"/>
+                    <pic:cNvPicPr>
+                      <a:picLocks noChangeAspect="1" noChangeArrowheads="1"/>
+                    </pic:cNvPicPr>
+                  </pic:nvPicPr>
+                  <pic:blipFill>
+                    <a:blip r:embed="rId8"/>
+                    <a:srcRect/>
+                    <a:stretch>
+                      <a:fillRect/>
+                    </a:stretch>
+                  </pic:blipFill>
+                  <pic:spPr bwMode="auto">
+                    <a:xfrm>
+                      <a:off x="0" y="0"/>
+                      <a:ext cx="3122785" cy="3891734"/>
+                    </a:xfrm>
+                    <a:prstGeom prst="rect">
+                      <a:avLst/>
+                    </a:prstGeom>
+                    <a:noFill/>
+                    <a:ln w="9525">
+                      <a:noFill/>
+                      <a:miter lim="800000"/>
+                      <a:headEnd/>
+                      <a:tailEnd/>
+                    </a:ln>
+                  </pic:spPr>
+                </pic:pic>
+              </a:graphicData>
+            </a:graphic>
+          </wp:inline>
+        </w:drawing>
+      </w:r>
+    </w:p>
+    <w:p>
+      <w:pPr>
+        <w:pStyle w:val="ab"/>
+        <w:spacing w:after="0"/>
+        <w:jc w:val="center"/>
+        <w:rPr>
+          <w:b w:val="0"/>
+          <w:color w:val="000000" w:themeColor="text1"/>
+          <w:sz w:val="28"/>
+          <w:szCs w:val="28"/>
+        </w:rPr>
+      </w:pPr>
+      <w:r>
+        <w:rPr>
+          <w:b w:val="0"/>
+          <w:color w:val="000000" w:themeColor="text1"/>
+          <w:sz w:val="28"/>
+          <w:szCs w:val="28"/>
+        </w:rPr>
+        <w:t xml:space="preserve">Рисунок </w:t>
+      </w:r>
+      <w:r>
+        <w:rPr>
+          <w:b w:val="0"/>
+          <w:color w:val="000000" w:themeColor="text1"/>
+          <w:sz w:val="28"/>
+          <w:szCs w:val="28"/>
+        </w:rPr>
+        <w:t>1.</w:t>
+      </w:r>
+      <w:r>
+        <w:rPr>
+          <w:b w:val="0"/>
+          <w:color w:val="000000" w:themeColor="text1"/>
+          <w:sz w:val="28"/>
+          <w:szCs w:val="28"/>
+        </w:rPr>
+        <w:fldChar w:fldCharType="begin"/>
+      </w:r>
+      <w:r>
+        <w:rPr>
+          <w:b w:val="0"/>
+          <w:color w:val="000000" w:themeColor="text1"/>
+          <w:sz w:val="28"/>
+          <w:szCs w:val="28"/>
+        </w:rPr>
+        <w:instrText xml:space="preserve"> SEQ Рисунок \* ARABIC </w:instrText>
+      </w:r>
+      <w:r>
+        <w:rPr>
+          <w:b w:val="0"/>
+          <w:color w:val="000000" w:themeColor="text1"/>
+          <w:sz w:val="28"/>
+          <w:szCs w:val="28"/>
+        </w:rPr>
+        <w:fldChar w:fldCharType="separate"/>
+      </w:r>
+      <w:r>
+        <w:rPr>
+          <w:b w:val="0"/>
+          <w:noProof/>
+          <w:color w:val="000000" w:themeColor="text1"/>
+          <w:sz w:val="28"/>
+          <w:szCs w:val="28"/>
+        </w:rPr>
+        <w:t>2</w:t>
+      </w:r>
+      <w:r>
+        <w:rPr>
+          <w:b w:val="0"/>
+          <w:color w:val="000000" w:themeColor="text1"/>
+          <w:sz w:val="28"/>
+          <w:szCs w:val="28"/>
+        </w:rPr>
+        <w:fldChar w:fldCharType="end"/>
+      </w:r>
+      <w:r>
+        <w:rPr>
+          <w:b w:val="0"/>
+          <w:color w:val="000000" w:themeColor="text1"/>
+          <w:sz w:val="28"/>
+          <w:szCs w:val="28"/>
+        </w:rPr>
+        <w:t xml:space="preserve"> - Окно создания заметки</w:t>
+      </w:r>
+    </w:p>
+    <w:p>
+      <w:pPr>
+        <w:spacing w:after="0" w:line="360" w:lineRule="auto"/>
+        <w:jc w:val="both"/>
+      </w:pPr>
+    </w:p>
+    <w:p>
+      <w:pPr>
+        <w:spacing w:after="0" w:line="360" w:lineRule="auto"/>
+        <w:jc w:val="both"/>
+        <w:rPr>
+          <w:sz w:val="28"/>
+          <w:szCs w:val="28"/>
+          <w:lang w:val="en-US"/>
+        </w:rPr>
+      </w:pPr>
+      <w:r>
+        <w:rPr>
+          <w:sz w:val="28"/>
+          <w:szCs w:val="28"/>
+        </w:rPr>
+        <w:tab/>
+      </w:r>
+      <w:r>
+        <w:rPr>
+          <w:sz w:val="28"/>
+          <w:szCs w:val="28"/>
+        </w:rPr>
+        <w:t>Данный интерфейс предлагает</w:t>
+      </w:r>
+      <w:r>
+        <w:rPr>
+          <w:sz w:val="28"/>
+          <w:szCs w:val="28"/>
+        </w:rPr>
+        <w:t xml:space="preserve"> ввести название заметки, которое будет отображаться в главном меню, описание и дату для заметки. После ввода соответствующих данных и нажатии на кнопку </w:t>
+      </w:r>
+      <w:r>
+        <w:rPr>
+          <w:sz w:val="28"/>
+          <w:szCs w:val="28"/>
+        </w:rPr>
+        <w:t>“</w:t>
+      </w:r>
+      <w:r>
+        <w:rPr>
+          <w:sz w:val="28"/>
+          <w:szCs w:val="28"/>
+        </w:rPr>
+        <w:t>Сохранить</w:t>
+      </w:r>
+      <w:r>
+        <w:rPr>
+          <w:sz w:val="28"/>
+          <w:szCs w:val="28"/>
+        </w:rPr>
+        <w:t>”</w:t>
+      </w:r>
+      <w:r>
+        <w:rPr>
+          <w:sz w:val="28"/>
+          <w:szCs w:val="28"/>
+        </w:rPr>
+        <w:t xml:space="preserve"> созданная заметка отобразится в главном списке.</w:t>
+      </w:r>
+    </w:p>
+    <w:p>
+      <w:pPr>
+        <w:keepNext/>
+        <w:spacing w:after="0" w:line="240" w:lineRule="auto"/>
+        <w:jc w:val="center"/>
+      </w:pPr>
+      <w:r>
+        <w:rPr>
+          <w:noProof/>
+          <w:sz w:val="28"/>
+          <w:szCs w:val="28"/>
+          <w:lang w:eastAsia="ru-RU"/>
+        </w:rPr>
+        <w:lastRenderedPageBreak/>
+        <w:drawing>
+          <wp:inline distT="0" distB="0" distL="0" distR="0">
+            <wp:extent cx="2858619" cy="3557567"/>
+            <wp:effectExtent l="19050" t="0" r="0" b="0"/>
+            <wp:docPr id="7" name="Рисунок 7"/>
+            <wp:cNvGraphicFramePr>
+              <a:graphicFrameLocks xmlns:a="http://schemas.openxmlformats.org/drawingml/2006/main" noChangeAspect="1"/>
+            </wp:cNvGraphicFramePr>
+            <a:graphic xmlns:a="http://schemas.openxmlformats.org/drawingml/2006/main">
+              <a:graphicData uri="http://schemas.openxmlformats.org/drawingml/2006/picture">
+                <pic:pic xmlns:pic="http://schemas.openxmlformats.org/drawingml/2006/picture">
+                  <pic:nvPicPr>
+                    <pic:cNvPr id="0" name="Picture 7"/>
+                    <pic:cNvPicPr>
+                      <a:picLocks noChangeAspect="1" noChangeArrowheads="1"/>
+                    </pic:cNvPicPr>
+                  </pic:nvPicPr>
+                  <pic:blipFill>
+                    <a:blip r:embed="rId9"/>
+                    <a:srcRect/>
+                    <a:stretch>
+                      <a:fillRect/>
+                    </a:stretch>
+                  </pic:blipFill>
+                  <pic:spPr bwMode="auto">
+                    <a:xfrm>
+                      <a:off x="0" y="0"/>
+                      <a:ext cx="2861228" cy="3560814"/>
+                    </a:xfrm>
+                    <a:prstGeom prst="rect">
+                      <a:avLst/>
+                    </a:prstGeom>
+                    <a:noFill/>
+                    <a:ln w="9525">
+                      <a:noFill/>
+                      <a:miter lim="800000"/>
+                      <a:headEnd/>
+                      <a:tailEnd/>
+                    </a:ln>
+                  </pic:spPr>
+                </pic:pic>
+              </a:graphicData>
+            </a:graphic>
+          </wp:inline>
+        </w:drawing>
+      </w:r>
+    </w:p>
+    <w:p>
+      <w:pPr>
+        <w:pStyle w:val="ab"/>
+        <w:spacing w:after="0"/>
+        <w:jc w:val="center"/>
+        <w:rPr>
+          <w:b w:val="0"/>
+          <w:color w:val="000000" w:themeColor="text1"/>
+          <w:sz w:val="28"/>
+          <w:szCs w:val="28"/>
+        </w:rPr>
+      </w:pPr>
+      <w:r>
+        <w:rPr>
+          <w:b w:val="0"/>
+          <w:color w:val="000000" w:themeColor="text1"/>
+          <w:sz w:val="28"/>
+          <w:szCs w:val="28"/>
+        </w:rPr>
+        <w:t xml:space="preserve">Рисунок </w:t>
+      </w:r>
+      <w:r>
+        <w:rPr>
+          <w:b w:val="0"/>
+          <w:color w:val="000000" w:themeColor="text1"/>
+          <w:sz w:val="28"/>
+          <w:szCs w:val="28"/>
+        </w:rPr>
+        <w:t>1.</w:t>
+      </w:r>
+      <w:r>
+        <w:rPr>
+          <w:b w:val="0"/>
+          <w:color w:val="000000" w:themeColor="text1"/>
+          <w:sz w:val="28"/>
+          <w:szCs w:val="28"/>
+        </w:rPr>
+        <w:fldChar w:fldCharType="begin"/>
+      </w:r>
+      <w:r>
+        <w:rPr>
+          <w:b w:val="0"/>
+          <w:color w:val="000000" w:themeColor="text1"/>
+          <w:sz w:val="28"/>
+          <w:szCs w:val="28"/>
+        </w:rPr>
+        <w:instrText xml:space="preserve"> SEQ Рисунок \* ARABIC </w:instrText>
+      </w:r>
+      <w:r>
+        <w:rPr>
+          <w:b w:val="0"/>
+          <w:color w:val="000000" w:themeColor="text1"/>
+          <w:sz w:val="28"/>
+          <w:szCs w:val="28"/>
+        </w:rPr>
+        <w:fldChar w:fldCharType="separate"/>
+      </w:r>
+      <w:r>
+        <w:rPr>
+          <w:b w:val="0"/>
+          <w:noProof/>
+          <w:color w:val="000000" w:themeColor="text1"/>
+          <w:sz w:val="28"/>
+          <w:szCs w:val="28"/>
+        </w:rPr>
+        <w:t>3</w:t>
+      </w:r>
+      <w:r>
+        <w:rPr>
+          <w:b w:val="0"/>
+          <w:color w:val="000000" w:themeColor="text1"/>
+          <w:sz w:val="28"/>
+          <w:szCs w:val="28"/>
+        </w:rPr>
+        <w:fldChar w:fldCharType="end"/>
+      </w:r>
+      <w:r>
+        <w:rPr>
+          <w:b w:val="0"/>
+          <w:color w:val="000000" w:themeColor="text1"/>
+          <w:sz w:val="28"/>
+          <w:szCs w:val="28"/>
+        </w:rPr>
+        <w:t xml:space="preserve"> - </w:t>
+      </w:r>
+      <w:r>
+        <w:rPr>
+          <w:b w:val="0"/>
+          <w:color w:val="000000" w:themeColor="text1"/>
+          <w:sz w:val="28"/>
+          <w:szCs w:val="28"/>
+        </w:rPr>
+        <w:t>Ввод данных в заметке</w:t>
+      </w:r>
+    </w:p>
+    <w:p>
+      <w:pPr>
+        <w:spacing w:after="0" w:line="360" w:lineRule="auto"/>
+        <w:jc w:val="both"/>
+        <w:rPr>
+          <w:color w:val="000000" w:themeColor="text1"/>
+          <w:sz w:val="28"/>
+          <w:szCs w:val="28"/>
+        </w:rPr>
+      </w:pPr>
+    </w:p>
+    <w:p>
+      <w:pPr>
+        <w:keepNext/>
+        <w:spacing w:after="0" w:line="240" w:lineRule="auto"/>
+        <w:jc w:val="center"/>
+      </w:pPr>
+      <w:r>
+        <w:rPr>
+          <w:noProof/>
+          <w:color w:val="000000" w:themeColor="text1"/>
+          <w:sz w:val="28"/>
+          <w:szCs w:val="28"/>
+          <w:lang w:eastAsia="ru-RU"/>
+        </w:rPr>
+        <w:drawing>
+          <wp:inline distT="0" distB="0" distL="0" distR="0">
+            <wp:extent cx="2884170" cy="3626272"/>
+            <wp:effectExtent l="19050" t="0" r="0" b="0"/>
+            <wp:docPr id="10" name="Рисунок 10"/>
+            <wp:cNvGraphicFramePr>
+              <a:graphicFrameLocks xmlns:a="http://schemas.openxmlformats.org/drawingml/2006/main" noChangeAspect="1"/>
+            </wp:cNvGraphicFramePr>
+            <a:graphic xmlns:a="http://schemas.openxmlformats.org/drawingml/2006/main">
+              <a:graphicData uri="http://schemas.openxmlformats.org/drawingml/2006/picture">
+                <pic:pic xmlns:pic="http://schemas.openxmlformats.org/drawingml/2006/picture">
+                  <pic:nvPicPr>
+                    <pic:cNvPr id="0" name="Picture 10"/>
+                    <pic:cNvPicPr>
+                      <a:picLocks noChangeAspect="1" noChangeArrowheads="1"/>
+                    </pic:cNvPicPr>
+                  </pic:nvPicPr>
+                  <pic:blipFill>
+                    <a:blip r:embed="rId10"/>
+                    <a:srcRect/>
+                    <a:stretch>
+                      <a:fillRect/>
+                    </a:stretch>
+                  </pic:blipFill>
+                  <pic:spPr bwMode="auto">
+                    <a:xfrm>
+                      <a:off x="0" y="0"/>
+                      <a:ext cx="2884170" cy="3626272"/>
+                    </a:xfrm>
+                    <a:prstGeom prst="rect">
+                      <a:avLst/>
+                    </a:prstGeom>
+                    <a:noFill/>
+                    <a:ln w="9525">
+                      <a:noFill/>
+                      <a:miter lim="800000"/>
+                      <a:headEnd/>
+                      <a:tailEnd/>
+                    </a:ln>
+                  </pic:spPr>
+                </pic:pic>
+              </a:graphicData>
+            </a:graphic>
+          </wp:inline>
+        </w:drawing>
+      </w:r>
+    </w:p>
+    <w:p>
+      <w:pPr>
+        <w:pStyle w:val="ab"/>
+        <w:spacing w:after="0"/>
+        <w:jc w:val="center"/>
+        <w:rPr>
+          <w:b w:val="0"/>
+          <w:color w:val="000000" w:themeColor="text1"/>
+          <w:sz w:val="28"/>
+          <w:szCs w:val="28"/>
+        </w:rPr>
+      </w:pPr>
+      <w:r>
+        <w:rPr>
+          <w:b w:val="0"/>
+          <w:color w:val="000000" w:themeColor="text1"/>
+          <w:sz w:val="28"/>
+          <w:szCs w:val="28"/>
+        </w:rPr>
+        <w:t xml:space="preserve">Рисунок </w:t>
+      </w:r>
+      <w:r>
+        <w:rPr>
+          <w:b w:val="0"/>
+          <w:color w:val="000000" w:themeColor="text1"/>
+          <w:sz w:val="28"/>
+          <w:szCs w:val="28"/>
+        </w:rPr>
+        <w:t>1.</w:t>
+      </w:r>
+      <w:r>
+        <w:rPr>
+          <w:b w:val="0"/>
+          <w:color w:val="000000" w:themeColor="text1"/>
+          <w:sz w:val="28"/>
+          <w:szCs w:val="28"/>
+        </w:rPr>
+        <w:fldChar w:fldCharType="begin"/>
+      </w:r>
+      <w:r>
+        <w:rPr>
+          <w:b w:val="0"/>
+          <w:color w:val="000000" w:themeColor="text1"/>
+          <w:sz w:val="28"/>
+          <w:szCs w:val="28"/>
+        </w:rPr>
+        <w:instrText xml:space="preserve"> SEQ Рисунок \* ARABIC </w:instrText>
+      </w:r>
+      <w:r>
+        <w:rPr>
+          <w:b w:val="0"/>
+          <w:color w:val="000000" w:themeColor="text1"/>
+          <w:sz w:val="28"/>
+          <w:szCs w:val="28"/>
+        </w:rPr>
+        <w:fldChar w:fldCharType="separate"/>
+      </w:r>
+      <w:r>
+        <w:rPr>
+          <w:b w:val="0"/>
+          <w:noProof/>
+          <w:color w:val="000000" w:themeColor="text1"/>
+          <w:sz w:val="28"/>
+          <w:szCs w:val="28"/>
+        </w:rPr>
+        <w:t>4</w:t>
+      </w:r>
+      <w:r>
+        <w:rPr>
+          <w:b w:val="0"/>
+          <w:color w:val="000000" w:themeColor="text1"/>
+          <w:sz w:val="28"/>
+          <w:szCs w:val="28"/>
+        </w:rPr>
+        <w:fldChar w:fldCharType="end"/>
+      </w:r>
+      <w:r>
+        <w:rPr>
+          <w:b w:val="0"/>
+          <w:color w:val="000000" w:themeColor="text1"/>
+          <w:sz w:val="28"/>
+          <w:szCs w:val="28"/>
+        </w:rPr>
+        <w:t xml:space="preserve"> - Отображение новой заметки</w:t>
+      </w:r>
+    </w:p>
+    <w:p>
+      <w:pPr>
+        <w:spacing w:after="0" w:line="360" w:lineRule="auto"/>
+        <w:jc w:val="both"/>
+        <w:rPr>
+          <w:sz w:val="28"/>
+        </w:rPr>
+      </w:pPr>
+    </w:p>
+    <w:p>
+      <w:pPr>
+        <w:spacing w:after="0" w:line="360" w:lineRule="auto"/>
+        <w:jc w:val="both"/>
+        <w:rPr>
+          <w:sz w:val="28"/>
+        </w:rPr>
+      </w:pPr>
+      <w:r>
+        <w:rPr>
+          <w:sz w:val="28"/>
+        </w:rPr>
+        <w:tab/>
+        <w:t xml:space="preserve">При выборе существующей заметки и нажатии на кнопку </w:t>
+      </w:r>
+      <w:r>
+        <w:rPr>
+          <w:sz w:val="28"/>
+        </w:rPr>
+        <w:t>“</w:t>
+      </w:r>
+      <w:r>
+        <w:rPr>
+          <w:sz w:val="28"/>
+        </w:rPr>
+        <w:t>Изменить</w:t>
+      </w:r>
+      <w:r>
+        <w:rPr>
+          <w:sz w:val="28"/>
+        </w:rPr>
+        <w:t>”</w:t>
+      </w:r>
+      <w:r>
+        <w:rPr>
+          <w:sz w:val="28"/>
+        </w:rPr>
+        <w:t xml:space="preserve"> совершится переход на окно создания и редактирования заметки с уже введенными в поля существующие данные заметки.</w:t>
+      </w:r>
+    </w:p>
+    <w:p>
+      <w:pPr>
+        <w:spacing w:after="0" w:line="360" w:lineRule="auto"/>
+        <w:jc w:val="both"/>
+        <w:rPr>
+          <w:sz w:val="28"/>
+        </w:rPr>
+      </w:pPr>
+    </w:p>
+    <w:p>
+      <w:pPr>
+        <w:spacing w:after="0" w:line="360" w:lineRule="auto"/>
+        <w:jc w:val="both"/>
+        <w:rPr>
+          <w:sz w:val="28"/>
+        </w:rPr>
+      </w:pPr>
+      <w:r>
+        <w:rPr>
+          <w:sz w:val="28"/>
+        </w:rPr>
+        <w:tab/>
+        <w:t xml:space="preserve">Данные поля можно будет изменить и после нажатия на </w:t>
+      </w:r>
+      <w:r>
+        <w:rPr>
+          <w:sz w:val="28"/>
+        </w:rPr>
+        <w:t>“</w:t>
+      </w:r>
+      <w:r>
+        <w:rPr>
+          <w:sz w:val="28"/>
+        </w:rPr>
+        <w:t>Сохранить</w:t>
+      </w:r>
+      <w:r>
+        <w:rPr>
+          <w:sz w:val="28"/>
+        </w:rPr>
+        <w:t>”</w:t>
+      </w:r>
+      <w:r>
+        <w:rPr>
+          <w:sz w:val="28"/>
+        </w:rPr>
+        <w:t>, новый заголовок отобразится в главном списке, а дата изменения заметки поменяется на более новую.</w:t>
+      </w:r>
+    </w:p>
+    <w:p>
+      <w:pPr>
+        <w:keepNext/>
+        <w:spacing w:after="0" w:line="240" w:lineRule="auto"/>
+        <w:jc w:val="center"/>
+      </w:pPr>
+      <w:r>
+        <w:rPr>
+          <w:noProof/>
+          <w:sz w:val="28"/>
+          <w:lang w:eastAsia="ru-RU"/>
+        </w:rPr>
+        <w:drawing>
+          <wp:inline distT="0" distB="0" distL="0" distR="0">
+            <wp:extent cx="3046663" cy="3791588"/>
+            <wp:effectExtent l="19050" t="0" r="1337" b="0"/>
+            <wp:docPr id="13" name="Рисунок 13"/>
+            <wp:cNvGraphicFramePr>
+              <a:graphicFrameLocks xmlns:a="http://schemas.openxmlformats.org/drawingml/2006/main" noChangeAspect="1"/>
+            </wp:cNvGraphicFramePr>
+            <a:graphic xmlns:a="http://schemas.openxmlformats.org/drawingml/2006/main">
+              <a:graphicData uri="http://schemas.openxmlformats.org/drawingml/2006/picture">
+                <pic:pic xmlns:pic="http://schemas.openxmlformats.org/drawingml/2006/picture">
+                  <pic:nvPicPr>
+                    <pic:cNvPr id="0" name="Picture 13"/>
+                    <pic:cNvPicPr>
+                      <a:picLocks noChangeAspect="1" noChangeArrowheads="1"/>
+                    </pic:cNvPicPr>
+                  </pic:nvPicPr>
+                  <pic:blipFill>
+                    <a:blip r:embed="rId11"/>
+                    <a:srcRect/>
+                    <a:stretch>
+                      <a:fillRect/>
+                    </a:stretch>
+                  </pic:blipFill>
+                  <pic:spPr bwMode="auto">
+                    <a:xfrm>
+                      <a:off x="0" y="0"/>
+                      <a:ext cx="3048757" cy="3794194"/>
+                    </a:xfrm>
+                    <a:prstGeom prst="rect">
+                      <a:avLst/>
+                    </a:prstGeom>
+                    <a:noFill/>
+                    <a:ln w="9525">
+                      <a:noFill/>
+                      <a:miter lim="800000"/>
+                      <a:headEnd/>
+                      <a:tailEnd/>
+                    </a:ln>
+                  </pic:spPr>
+                </pic:pic>
+              </a:graphicData>
+            </a:graphic>
+          </wp:inline>
+        </w:drawing>
+      </w:r>
+    </w:p>
+    <w:p>
+      <w:pPr>
+        <w:pStyle w:val="ab"/>
+        <w:spacing w:after="0"/>
+        <w:jc w:val="center"/>
+        <w:rPr>
+          <w:b w:val="0"/>
+          <w:color w:val="000000" w:themeColor="text1"/>
+          <w:sz w:val="28"/>
+          <w:szCs w:val="28"/>
+        </w:rPr>
+      </w:pPr>
+      <w:r>
+        <w:rPr>
+          <w:b w:val="0"/>
+          <w:color w:val="000000" w:themeColor="text1"/>
+          <w:sz w:val="28"/>
+          <w:szCs w:val="28"/>
+        </w:rPr>
+        <w:t xml:space="preserve">Рисунок </w:t>
+      </w:r>
+      <w:r>
+        <w:rPr>
+          <w:b w:val="0"/>
+          <w:color w:val="000000" w:themeColor="text1"/>
+          <w:sz w:val="28"/>
+          <w:szCs w:val="28"/>
+        </w:rPr>
+        <w:t>1.</w:t>
+      </w:r>
+      <w:r>
+        <w:rPr>
+          <w:b w:val="0"/>
+          <w:color w:val="000000" w:themeColor="text1"/>
+          <w:sz w:val="28"/>
+          <w:szCs w:val="28"/>
+        </w:rPr>
+        <w:fldChar w:fldCharType="begin"/>
+      </w:r>
+      <w:r>
+        <w:rPr>
+          <w:b w:val="0"/>
+          <w:color w:val="000000" w:themeColor="text1"/>
+          <w:sz w:val="28"/>
+          <w:szCs w:val="28"/>
+        </w:rPr>
+        <w:instrText xml:space="preserve"> SEQ Рисунок \* ARABIC </w:instrText>
+      </w:r>
+      <w:r>
+        <w:rPr>
+          <w:b w:val="0"/>
+          <w:color w:val="000000" w:themeColor="text1"/>
+          <w:sz w:val="28"/>
+          <w:szCs w:val="28"/>
+        </w:rPr>
+        <w:fldChar w:fldCharType="separate"/>
+      </w:r>
+      <w:r>
+        <w:rPr>
+          <w:b w:val="0"/>
+          <w:noProof/>
+          <w:color w:val="000000" w:themeColor="text1"/>
+          <w:sz w:val="28"/>
+          <w:szCs w:val="28"/>
+        </w:rPr>
+        <w:t>5</w:t>
+      </w:r>
+      <w:r>
+        <w:rPr>
+          <w:b w:val="0"/>
+          <w:color w:val="000000" w:themeColor="text1"/>
+          <w:sz w:val="28"/>
+          <w:szCs w:val="28"/>
+        </w:rPr>
+        <w:fldChar w:fldCharType="end"/>
+      </w:r>
+      <w:r>
+        <w:rPr>
+          <w:b w:val="0"/>
+          <w:color w:val="000000" w:themeColor="text1"/>
+          <w:sz w:val="28"/>
+          <w:szCs w:val="28"/>
+        </w:rPr>
+        <w:t xml:space="preserve"> - Ввод новых значений заметки</w:t>
+      </w:r>
+    </w:p>
+    <w:p>
+      <w:pPr>
+        <w:spacing w:after="0" w:line="360" w:lineRule="auto"/>
+        <w:jc w:val="both"/>
+        <w:rPr>
+          <w:sz w:val="28"/>
+        </w:rPr>
+      </w:pPr>
+    </w:p>
+    <w:p>
+      <w:pPr>
+        <w:keepNext/>
+        <w:spacing w:after="0" w:line="240" w:lineRule="auto"/>
+        <w:jc w:val="center"/>
+      </w:pPr>
+      <w:r>
+        <w:rPr>
+          <w:noProof/>
+          <w:sz w:val="28"/>
+          <w:lang w:eastAsia="ru-RU"/>
+        </w:rPr>
+        <w:lastRenderedPageBreak/>
+        <w:drawing>
+          <wp:inline distT="0" distB="0" distL="0" distR="0">
+            <wp:extent cx="2810177" cy="3523442"/>
+            <wp:effectExtent l="19050" t="0" r="9223" b="0"/>
+            <wp:docPr id="16" name="Рисунок 16"/>
+            <wp:cNvGraphicFramePr>
+              <a:graphicFrameLocks xmlns:a="http://schemas.openxmlformats.org/drawingml/2006/main" noChangeAspect="1"/>
+            </wp:cNvGraphicFramePr>
+            <a:graphic xmlns:a="http://schemas.openxmlformats.org/drawingml/2006/main">
+              <a:graphicData uri="http://schemas.openxmlformats.org/drawingml/2006/picture">
+                <pic:pic xmlns:pic="http://schemas.openxmlformats.org/drawingml/2006/picture">
+                  <pic:nvPicPr>
+                    <pic:cNvPr id="0" name="Picture 16"/>
+                    <pic:cNvPicPr>
+                      <a:picLocks noChangeAspect="1" noChangeArrowheads="1"/>
+                    </pic:cNvPicPr>
+                  </pic:nvPicPr>
+                  <pic:blipFill>
+                    <a:blip r:embed="rId12"/>
+                    <a:srcRect/>
+                    <a:stretch>
+                      <a:fillRect/>
+                    </a:stretch>
+                  </pic:blipFill>
+                  <pic:spPr bwMode="auto">
+                    <a:xfrm>
+                      <a:off x="0" y="0"/>
+                      <a:ext cx="2812127" cy="3525887"/>
+                    </a:xfrm>
+                    <a:prstGeom prst="rect">
+                      <a:avLst/>
+                    </a:prstGeom>
+                    <a:noFill/>
+                    <a:ln w="9525">
+                      <a:noFill/>
+                      <a:miter lim="800000"/>
+                      <a:headEnd/>
+                      <a:tailEnd/>
+                    </a:ln>
+                  </pic:spPr>
+                </pic:pic>
+              </a:graphicData>
+            </a:graphic>
+          </wp:inline>
+        </w:drawing>
+      </w:r>
+    </w:p>
+    <w:p>
+      <w:pPr>
+        <w:pStyle w:val="ab"/>
+        <w:spacing w:after="0"/>
+        <w:jc w:val="center"/>
+        <w:rPr>
+          <w:b w:val="0"/>
+          <w:color w:val="000000" w:themeColor="text1"/>
+          <w:sz w:val="28"/>
+          <w:szCs w:val="28"/>
+        </w:rPr>
+      </w:pPr>
+      <w:r>
+        <w:rPr>
+          <w:b w:val="0"/>
+          <w:color w:val="000000" w:themeColor="text1"/>
+          <w:sz w:val="28"/>
+          <w:szCs w:val="28"/>
+        </w:rPr>
+        <w:t>Рисунок 1.</w:t>
+      </w:r>
+      <w:r>
+        <w:rPr>
+          <w:b w:val="0"/>
+          <w:color w:val="000000" w:themeColor="text1"/>
+          <w:sz w:val="28"/>
+          <w:szCs w:val="28"/>
+        </w:rPr>
+        <w:fldChar w:fldCharType="begin"/>
+      </w:r>
+      <w:r>
+        <w:rPr>
+          <w:b w:val="0"/>
+          <w:color w:val="000000" w:themeColor="text1"/>
+          <w:sz w:val="28"/>
+          <w:szCs w:val="28"/>
+        </w:rPr>
+        <w:instrText xml:space="preserve"> SEQ Рисунок \* ARABIC </w:instrText>
+      </w:r>
+      <w:r>
+        <w:rPr>
+          <w:b w:val="0"/>
+          <w:color w:val="000000" w:themeColor="text1"/>
+          <w:sz w:val="28"/>
+          <w:szCs w:val="28"/>
+        </w:rPr>
+        <w:fldChar w:fldCharType="separate"/>
+      </w:r>
+      <w:r>
+        <w:rPr>
+          <w:b w:val="0"/>
+          <w:noProof/>
+          <w:color w:val="000000" w:themeColor="text1"/>
+          <w:sz w:val="28"/>
+          <w:szCs w:val="28"/>
+        </w:rPr>
+        <w:t>6</w:t>
+      </w:r>
+      <w:r>
+        <w:rPr>
+          <w:b w:val="0"/>
+          <w:color w:val="000000" w:themeColor="text1"/>
+          <w:sz w:val="28"/>
+          <w:szCs w:val="28"/>
+        </w:rPr>
+        <w:fldChar w:fldCharType="end"/>
+      </w:r>
+      <w:r>
+        <w:rPr>
+          <w:b w:val="0"/>
+          <w:color w:val="000000" w:themeColor="text1"/>
+          <w:sz w:val="28"/>
+          <w:szCs w:val="28"/>
+        </w:rPr>
+        <w:t xml:space="preserve"> - Отображение изменений на главном экране</w:t>
+      </w:r>
+    </w:p>
+    <w:p>
+      <w:pPr>
+        <w:spacing w:after="0" w:line="360" w:lineRule="auto"/>
+        <w:jc w:val="both"/>
+        <w:rPr>
+          <w:sz w:val="28"/>
+        </w:rPr>
+      </w:pPr>
+    </w:p>
+    <w:p>
+      <w:pPr>
+        <w:spacing w:after="0" w:line="360" w:lineRule="auto"/>
+        <w:jc w:val="both"/>
+        <w:rPr>
+          <w:sz w:val="28"/>
+        </w:rPr>
+      </w:pPr>
+      <w:r>
+        <w:rPr>
+          <w:sz w:val="28"/>
+        </w:rPr>
+        <w:tab/>
+      </w:r>
+      <w:r>
+        <w:rPr>
+          <w:sz w:val="28"/>
+        </w:rPr>
+        <w:t xml:space="preserve">При выборе элемента в списке и после нажатия на </w:t>
+      </w:r>
+      <w:r>
+        <w:rPr>
+          <w:sz w:val="28"/>
+        </w:rPr>
+        <w:t>“</w:t>
+      </w:r>
+      <w:r>
+        <w:rPr>
+          <w:sz w:val="28"/>
+        </w:rPr>
+        <w:t>Удалить</w:t>
+      </w:r>
+      <w:r>
+        <w:rPr>
+          <w:sz w:val="28"/>
+        </w:rPr>
+        <w:t>”</w:t>
+      </w:r>
+      <w:r>
+        <w:rPr>
+          <w:sz w:val="28"/>
+        </w:rPr>
+        <w:t xml:space="preserve"> сама заметки удалится и курсор выделения переместится на заметку выше.</w:t>
+      </w:r>
+    </w:p>
+    <w:p>
+      <w:pPr>
         <w:rPr>
           <w:rFonts w:ascii="Times New Roman" w:hAnsi="Times New Roman" w:cs="Times New Roman"/>
           <w:b/>
@@ -1306,6 +2318,28 @@
           <w:sz w:val="28"/>
           <w:szCs w:val="28"/>
         </w:rPr>
+        <w:br w:type="page"/>
+      </w:r>
+    </w:p>
+    <w:p>
+      <w:pPr>
+        <w:spacing w:after="0" w:line="360" w:lineRule="auto"/>
+        <w:jc w:val="center"/>
+        <w:rPr>
+          <w:rFonts w:ascii="Times New Roman" w:hAnsi="Times New Roman" w:cs="Times New Roman"/>
+          <w:b/>
+          <w:sz w:val="28"/>
+          <w:szCs w:val="28"/>
+        </w:rPr>
+      </w:pPr>
+      <w:r>
+        <w:rPr>
+          <w:rFonts w:ascii="Times New Roman" w:hAnsi="Times New Roman" w:cs="Times New Roman"/>
+          <w:b/>
+          <w:sz w:val="28"/>
+          <w:szCs w:val="28"/>
+        </w:rPr>
+        <w:lastRenderedPageBreak/>
         <w:t>ЗАКЛЮЧЕНИЕ</w:t>
       </w:r>
     </w:p>
@@ -1317,11 +2351,21 @@
           <w:rFonts w:ascii="Times New Roman" w:hAnsi="Times New Roman" w:cs="Times New Roman"/>
           <w:sz w:val="28"/>
           <w:szCs w:val="28"/>
-        </w:rPr>
-      </w:pPr>
+          <w:lang w:val="en-US"/>
+        </w:rPr>
+      </w:pPr>
+      <w:r>
+        <w:rPr>
+          <w:rFonts w:ascii="Times New Roman" w:hAnsi="Times New Roman" w:cs="Times New Roman"/>
+          <w:sz w:val="28"/>
+          <w:szCs w:val="28"/>
+        </w:rPr>
+        <w:tab/>
+        <w:t>В данной лабораторной работе было разработано простейшее двухстраничное приложение, позволяющее создавать, редактировать и удалять заметки.</w:t>
+      </w:r>
     </w:p>
     <w:sectPr>
-      <w:footerReference w:type="default" r:id="rId8"/>
+      <w:footerReference w:type="default" r:id="rId13"/>
       <w:pgSz w:w="11906" w:h="16838"/>
       <w:pgMar w:top="1134" w:right="850" w:bottom="1134" w:left="1701" w:header="708" w:footer="708" w:gutter="0"/>
       <w:cols w:space="708"/>
@@ -1400,7 +2444,7 @@
             <w:sz w:val="28"/>
             <w:szCs w:val="28"/>
           </w:rPr>
-          <w:t>3</w:t>
+          <w:t>8</w:t>
         </w:r>
         <w:r>
           <w:rPr>

</xml_diff>